<commit_message>
feat(examples): enrich the showcase templates with more representative components
Add components a real corporate template carries, exercising extraction and the
now-broader generator:
- docx: a real external w:hyperlink in the body (a near-universal element the
  generator now also authors natively).
- pptx: speaker notes on the executive-summary slide (a standard deck artifact).
- xlsx: distributed-template sheet protection on Inputs with ONLY the input value
  cells (B4:B7) unlocked, plus a print header/footer with live fields (&[Tab],
  Page &P of &N).

All three rebuilt templates still extract with 0 schema problems and the
kitchen-sink + full suite stay green (264 passed, 4 skipped).

Co-Authored-By: Claude Opus 4.8 (1M context) <noreply@anthropic.com>
</commit_message>
<xml_diff>
--- a/examples/templates/branddocs_template.docx
+++ b/examples/templates/branddocs_template.docx
@@ -1253,10 +1253,20 @@
       </w:r>
     </w:p>
     <w:p>
+      <w:r>
+        <w:t xml:space="preserve">Full brand guidelines: </w:t>
+      </w:r>
+      <w:hyperlink r:id="rId12">
+        <w:r>
+          <w:t xml:space="preserve">brand.example.com</w:t>
+        </w:r>
+      </w:hyperlink>
+    </w:p>
+    <w:p>
       <w:pPr>
         <w:sectPr>
-          <w:headerReference w:type="default" r:id="rId12"/>
-          <w:footerReference w:type="default" r:id="rId13"/>
+          <w:headerReference w:type="default" r:id="rId13"/>
+          <w:footerReference w:type="default" r:id="rId14"/>
           <w:pgSz w:w="12240" w:h="15840"/>
           <w:pgMar w:top="1440" w:right="1800" w:bottom="1440" w:left="1800" w:header="720" w:footer="720" w:gutter="0"/>
           <w:cols w:space="720"/>

</xml_diff>